<commit_message>
-Se agrega analisis de los resultados
</commit_message>
<xml_diff>
--- a/documentacion/SOA_Plantilla_Metricas/Metricas.docx
+++ b/documentacion/SOA_Plantilla_Metricas/Metricas.docx
@@ -111,27 +111,13 @@
         <w:rPr>
           <w:rFonts w:ascii="Times New Roman" w:eastAsia="Times New Roman" w:hAnsi="Times New Roman" w:cs="Times New Roman"/>
         </w:rPr>
-        <w:t xml:space="preserve"> especializadas en la definición de </w:t>
-      </w:r>
-      <w:proofErr w:type="spellStart"/>
-      <w:r>
-        <w:rPr>
-          <w:rFonts w:ascii="Times New Roman" w:eastAsia="Times New Roman" w:hAnsi="Times New Roman" w:cs="Times New Roman"/>
-        </w:rPr>
-        <w:t>prom</w:t>
-      </w:r>
-      <w:r>
-        <w:rPr>
-          <w:rFonts w:ascii="Times New Roman" w:eastAsia="Times New Roman" w:hAnsi="Times New Roman" w:cs="Times New Roman"/>
-        </w:rPr>
-        <w:t>pts</w:t>
-      </w:r>
-      <w:proofErr w:type="spellEnd"/>
-      <w:r>
-        <w:rPr>
-          <w:rFonts w:ascii="Times New Roman" w:eastAsia="Times New Roman" w:hAnsi="Times New Roman" w:cs="Times New Roman"/>
-        </w:rPr>
-        <w:t xml:space="preserve"> y la utilización de diferentes herramientas de inteligencia artificial generativa</w:t>
+        <w:t xml:space="preserve"> especializadas en la definición de prom</w:t>
+      </w:r>
+      <w:r>
+        <w:rPr>
+          <w:rFonts w:ascii="Times New Roman" w:eastAsia="Times New Roman" w:hAnsi="Times New Roman" w:cs="Times New Roman"/>
+        </w:rPr>
+        <w:t>pts y la utilización de diferentes herramientas de inteligencia artificial generativa</w:t>
       </w:r>
       <w:r>
         <w:rPr>
@@ -269,6 +255,26 @@
         </w:rPr>
         <w:t xml:space="preserve"> ejecución de la solución. </w:t>
       </w:r>
+      <w:r>
+        <w:rPr>
+          <w:rFonts w:ascii="Times New Roman" w:eastAsia="Times New Roman" w:hAnsi="Times New Roman" w:cs="Times New Roman"/>
+        </w:rPr>
+        <w:t xml:space="preserve">(para </w:t>
+      </w:r>
+      <w:proofErr w:type="gramStart"/>
+      <w:r>
+        <w:rPr>
+          <w:rFonts w:ascii="Times New Roman" w:eastAsia="Times New Roman" w:hAnsi="Times New Roman" w:cs="Times New Roman"/>
+        </w:rPr>
+        <w:t>los dos comisiones</w:t>
+      </w:r>
+      <w:proofErr w:type="gramEnd"/>
+      <w:r>
+        <w:rPr>
+          <w:rFonts w:ascii="Times New Roman" w:eastAsia="Times New Roman" w:hAnsi="Times New Roman" w:cs="Times New Roman"/>
+        </w:rPr>
+        <w:t>)</w:t>
+      </w:r>
     </w:p>
     <w:p>
       <w:pPr>
@@ -297,6 +303,12 @@
         </w:rPr>
         <w:t xml:space="preserve"> Basándose en los datos de uso de recursos computacionales, se estimará el consumo energético asociado a cada enfoque. </w:t>
       </w:r>
+      <w:r>
+        <w:rPr>
+          <w:rFonts w:ascii="Times New Roman" w:eastAsia="Times New Roman" w:hAnsi="Times New Roman" w:cs="Times New Roman"/>
+        </w:rPr>
+        <w:t>(Android)</w:t>
+      </w:r>
     </w:p>
     <w:p>
       <w:pPr>
@@ -356,13 +368,26 @@
         <w:rPr>
           <w:rFonts w:ascii="Times New Roman" w:eastAsia="Times New Roman" w:hAnsi="Times New Roman" w:cs="Times New Roman"/>
         </w:rPr>
-        <w:t xml:space="preserve"> Se evaluará el grado en que el código desarrollado cumple con la totalidad de los requisitos funcionales especificados en la consigna. Esta métrica es la más importante para determinar la efectividad del resultado final.</w:t>
+        <w:t xml:space="preserve"> Se evaluará el grado en que el código desarrollado cumple con la totalidad de los requisitos funcionales especificados en la consigna. Esta métrica es </w:t>
+      </w:r>
+      <w:r>
+        <w:rPr>
+          <w:rFonts w:ascii="Times New Roman" w:eastAsia="Times New Roman" w:hAnsi="Times New Roman" w:cs="Times New Roman"/>
+        </w:rPr>
+        <w:lastRenderedPageBreak/>
+        <w:t>la más importante para determinar la efectividad del resultado final.</w:t>
       </w:r>
       <w:r>
         <w:rPr>
           <w:rFonts w:ascii="Times New Roman" w:eastAsia="Times New Roman" w:hAnsi="Times New Roman" w:cs="Times New Roman"/>
         </w:rPr>
         <w:t xml:space="preserve"> Se llevará a cabo mediante rúbricas</w:t>
+      </w:r>
+      <w:r>
+        <w:rPr>
+          <w:rFonts w:ascii="Times New Roman" w:eastAsia="Times New Roman" w:hAnsi="Times New Roman" w:cs="Times New Roman"/>
+        </w:rPr>
+        <w:t xml:space="preserve"> (Rubrica dos comisiones)</w:t>
       </w:r>
     </w:p>
     <w:p>
@@ -384,14 +409,33 @@
           <w:b/>
           <w:bCs/>
         </w:rPr>
-        <w:lastRenderedPageBreak/>
         <w:t>Legibilidad y Mantenibilidad del Código:</w:t>
       </w:r>
       <w:r>
         <w:rPr>
           <w:rFonts w:ascii="Times New Roman" w:eastAsia="Times New Roman" w:hAnsi="Times New Roman" w:cs="Times New Roman"/>
         </w:rPr>
-        <w:t xml:space="preserve"> Utilizando una rúbrica predefinida y/o herramientas de análisis estático, se valorará la claridad, la organización y la consistencia del código. Se analizará la estructura, la nomenclatura de variables y funciones, y la calidad de los comentarios y la documentación.</w:t>
+        <w:t xml:space="preserve"> Utilizando una rúbrica predefinida y/o herramientas de análisis estático, se valorará la claridad, la organización y la consistencia del código. Se analizará la estructura, la nomenclatura de variables y funciones, y la calidad de los comentarios y la </w:t>
+      </w:r>
+      <w:proofErr w:type="gramStart"/>
+      <w:r>
+        <w:rPr>
+          <w:rFonts w:ascii="Times New Roman" w:eastAsia="Times New Roman" w:hAnsi="Times New Roman" w:cs="Times New Roman"/>
+        </w:rPr>
+        <w:t>documentación.</w:t>
+      </w:r>
+      <w:r>
+        <w:rPr>
+          <w:rFonts w:ascii="Times New Roman" w:eastAsia="Times New Roman" w:hAnsi="Times New Roman" w:cs="Times New Roman"/>
+        </w:rPr>
+        <w:t>(</w:t>
+      </w:r>
+      <w:proofErr w:type="gramEnd"/>
+      <w:r>
+        <w:rPr>
+          <w:rFonts w:ascii="Times New Roman" w:eastAsia="Times New Roman" w:hAnsi="Times New Roman" w:cs="Times New Roman"/>
+        </w:rPr>
+        <w:t>rubrica y roben)(los dos)</w:t>
       </w:r>
     </w:p>
     <w:p>
@@ -476,7 +520,6 @@
         </w:rPr>
         <w:t xml:space="preserve"> Se evaluará la dependencia de los alumnos con respecto a las herramientas de IA. Esto podría medirse a través del análisis de las interacciones con la herramienta (ej., cantidad de </w:t>
       </w:r>
-      <w:proofErr w:type="spellStart"/>
       <w:r>
         <w:rPr>
           <w:rFonts w:ascii="Times New Roman" w:eastAsia="Times New Roman" w:hAnsi="Times New Roman" w:cs="Times New Roman"/>
@@ -485,12 +528,49 @@
         </w:rPr>
         <w:t>prompts</w:t>
       </w:r>
-      <w:proofErr w:type="spellEnd"/>
       <w:r>
         <w:rPr>
           <w:rFonts w:ascii="Times New Roman" w:eastAsia="Times New Roman" w:hAnsi="Times New Roman" w:cs="Times New Roman"/>
         </w:rPr>
         <w:t xml:space="preserve"> utilizados, tiempo de interacción) o mediante una encuesta posterior sobre la percepción de dependencia.</w:t>
+      </w:r>
+    </w:p>
+    <w:p>
+      <w:pPr>
+        <w:pStyle w:val="Prrafodelista"/>
+        <w:spacing w:before="240" w:after="240"/>
+        <w:jc w:val="both"/>
+        <w:rPr>
+          <w:rFonts w:ascii="Times New Roman" w:eastAsia="Times New Roman" w:hAnsi="Times New Roman" w:cs="Times New Roman"/>
+          <w:color w:val="FF0000"/>
+        </w:rPr>
+      </w:pPr>
+      <w:r>
+        <w:rPr>
+          <w:rFonts w:ascii="Times New Roman" w:eastAsia="Times New Roman" w:hAnsi="Times New Roman" w:cs="Times New Roman"/>
+          <w:b/>
+          <w:bCs/>
+          <w:color w:val="FF0000"/>
+        </w:rPr>
+        <w:t xml:space="preserve">Agregar </w:t>
+      </w:r>
+      <w:r>
+        <w:rPr>
+          <w:rFonts w:ascii="Times New Roman" w:eastAsia="Times New Roman" w:hAnsi="Times New Roman" w:cs="Times New Roman"/>
+          <w:b/>
+          <w:bCs/>
+          <w:color w:val="FF0000"/>
+        </w:rPr>
+        <w:t>el uso de token</w:t>
+      </w:r>
+      <w:r>
+        <w:rPr>
+          <w:rFonts w:ascii="Times New Roman" w:eastAsia="Times New Roman" w:hAnsi="Times New Roman" w:cs="Times New Roman"/>
+          <w:b/>
+          <w:bCs/>
+          <w:color w:val="FF0000"/>
+        </w:rPr>
+        <w:t xml:space="preserve"> (que nos pasen el prompt)</w:t>
       </w:r>
     </w:p>
     <w:p>
@@ -511,14 +591,22 @@
           <w:rFonts w:ascii="Times New Roman" w:eastAsia="Times New Roman" w:hAnsi="Times New Roman" w:cs="Times New Roman"/>
           <w:b/>
           <w:bCs/>
+          <w:highlight w:val="yellow"/>
         </w:rPr>
         <w:t>Nivel de Conocimiento del Alumno:</w:t>
       </w:r>
       <w:r>
         <w:rPr>
           <w:rFonts w:ascii="Times New Roman" w:eastAsia="Times New Roman" w:hAnsi="Times New Roman" w:cs="Times New Roman"/>
-        </w:rPr>
-        <w:t xml:space="preserve"> Antes y después del experimento, se evaluará el nivel de conocimiento técnico de cada alumno. Esta métrica servirá como una variable de control, permitiendo analizar cómo el nivel de conocimiento previo influye en el rendimiento con o sin herramientas de IA. El grupo de control sin IA será clave para medir la base de habilidades de programación.</w:t>
+          <w:highlight w:val="yellow"/>
+        </w:rPr>
+        <w:t xml:space="preserve"> Antes y después del experimento, se evaluará el nivel de conocimiento técnico de cada alumno. Esta métrica servirá como una variable de control, permitiendo analizar cómo el nivel de conocimiento previo influye en el rendimiento con o sin herramientas de IA. El grupo de control sin IA será clave para medir la base de habilidades de programación</w:t>
+      </w:r>
+      <w:r>
+        <w:rPr>
+          <w:rFonts w:ascii="Times New Roman" w:eastAsia="Times New Roman" w:hAnsi="Times New Roman" w:cs="Times New Roman"/>
+        </w:rPr>
+        <w:t>.</w:t>
       </w:r>
     </w:p>
     <w:p>
@@ -1327,6 +1415,7 @@
   <w:style w:type="character" w:default="1" w:styleId="Fuentedeprrafopredeter">
     <w:name w:val="Default Paragraph Font"/>
     <w:uiPriority w:val="1"/>
+    <w:semiHidden/>
     <w:unhideWhenUsed/>
   </w:style>
   <w:style w:type="table" w:default="1" w:styleId="Tablanormal">

</xml_diff>